<commit_message>
Demonstrate NVCA charter revisions in a pull request
</commit_message>
<xml_diff>
--- a/contracts/certificate-of-incorporation.docx
+++ b/contracts/certificate-of-incorporation.docx
@@ -1308,7 +1308,7 @@
           <w:szCs w:val="22"/>
         </w:rPr>
         <w:br/>
-        <w:t>[_________]</w:t>
+        <w:t xml:space="preserve">Aurora Robotics, Inc.</w:t>
       </w:r>
     </w:p>
     <w:p>
@@ -1343,7 +1343,7 @@
         <w:pStyle w:val="BodyText"/>
       </w:pPr>
       <w:r>
-        <w:t>[____________], a corporation organized and existing under and by virtue of the provisions of the General Corporation Law of the State of Delaware (the “</w:t>
+        <w:t xml:space="preserve">Aurora Robotics, Inc., a corporation organized and existing under and by virtue of the provisions of the General Corporation Law of the State of Delaware (the “</w:t>
       </w:r>
       <w:r>
         <w:rPr>
@@ -1390,7 +1390,7 @@
         <w:rPr>
           <w:szCs w:val="22"/>
         </w:rPr>
-        <w:t>That the name of this corporation is [_______________], and that this corporation was originally incorporated pursuant to the General Corporation Law on [________ __, 20__] [under the name [_______________]].</w:t>
+        <w:t xml:space="preserve">That the name of this corporation is Aurora Robotics, Inc., and that this corporation was originally incorporated pursuant to the General Corporation Law on [________ __, 20__] [under the name [_______________]].</w:t>
       </w:r>
       <w:bookmarkStart w:name="_DV_C30" w:id="40"/>
       <w:r>
@@ -1501,7 +1501,7 @@
         <w:rPr>
           <w:szCs w:val="22"/>
         </w:rPr>
-        <w:t xml:space="preserve">The name of this corporation is [_______________] (the </w:t>
+        <w:t xml:space="preserve">The name of this corporation is Aurora Robotics, Inc. (the </w:t>
       </w:r>
       <w:r>
         <w:rPr>
@@ -1700,25 +1700,25 @@
         <w:rPr>
           <w:szCs w:val="22"/>
         </w:rPr>
-        <w:t xml:space="preserve"> [______]</w:t>
-      </w:r>
-      <w:r>
-        <w:rPr>
-          <w:szCs w:val="22"/>
-        </w:rPr>
-        <w:t>. The Corporation has [two] classes of stock, referred to as Common Stock and Preferred Stock. There are</w:t>
-      </w:r>
-      <w:r>
-        <w:rPr>
-          <w:szCs w:val="22"/>
-        </w:rPr>
-        <w:t xml:space="preserve"> </w:t>
-      </w:r>
-      <w:r>
-        <w:rPr>
-          <w:szCs w:val="22"/>
-        </w:rPr>
-        <w:t xml:space="preserve">[_____] shares </w:t>
+        <w:t xml:space="preserve"> 15,000,000</w:t>
+      </w:r>
+      <w:r>
+        <w:rPr>
+          <w:szCs w:val="22"/>
+        </w:rPr>
+        <w:t xml:space="preserve">. The Corporation has two classes of stock, referred to as Common Stock and Preferred Stock. There are</w:t>
+      </w:r>
+      <w:r>
+        <w:rPr>
+          <w:szCs w:val="22"/>
+        </w:rPr>
+        <w:t xml:space="preserve"> </w:t>
+      </w:r>
+      <w:r>
+        <w:rPr>
+          <w:szCs w:val="22"/>
+        </w:rPr>
+        <w:t xml:space="preserve">10,000,000 shares </w:t>
       </w:r>
       <w:r>
         <w:rPr>
@@ -1730,7 +1730,7 @@
         <w:rPr>
           <w:szCs w:val="22"/>
         </w:rPr>
-        <w:t>Common Stock, $[_____] par value per share (“</w:t>
+        <w:t xml:space="preserve">Common Stock, $0.0001 par value per share (“</w:t>
       </w:r>
       <w:r>
         <w:rPr>
@@ -1764,7 +1764,7 @@
         <w:rPr>
           <w:szCs w:val="22"/>
         </w:rPr>
-        <w:t xml:space="preserve"> and [______] shares </w:t>
+        <w:t xml:space="preserve"> and 5,000,000 shares </w:t>
       </w:r>
       <w:r>
         <w:rPr>
@@ -1776,7 +1776,7 @@
         <w:rPr>
           <w:szCs w:val="22"/>
         </w:rPr>
-        <w:t xml:space="preserve">Preferred Stock, $[______] par value per </w:t>
+        <w:t xml:space="preserve">Preferred Stock, $0.0001 par value per </w:t>
       </w:r>
       <w:r>
         <w:rPr>
@@ -1803,7 +1803,7 @@
         <w:rPr>
           <w:szCs w:val="22"/>
         </w:rPr>
-        <w:t>, [all] of which are hereby designated as “</w:t>
+        <w:t xml:space="preserve">, all of which are hereby designated as “</w:t>
       </w:r>
       <w:r>
         <w:rPr>
@@ -4733,13 +4733,13 @@
         <w:t xml:space="preserve"> equal to </w:t>
       </w:r>
       <w:r>
-        <w:t>the greater of (i) [__</w:t>
-      </w:r>
-      <w:r>
-        <w:t xml:space="preserve"> times</w:t>
-      </w:r>
-      <w:r>
-        <w:t>]</w:t>
+        <w:t xml:space="preserve">the greater of (i) 1.5 times</w:t>
+      </w:r>
+      <w:r>
+        <w:t xml:space="preserve"/>
+      </w:r>
+      <w:r>
+        <w:t xml:space="preserve"/>
       </w:r>
       <w:r>
         <w:t xml:space="preserve"> the applicable </w:t>
@@ -18872,6 +18872,14 @@
       </w:r>
       <w:r>
         <w:t xml:space="preserve"> in compliance with the provisions of the General Corporation Law, and shall be deemed sent upon such mailing or electronic transmission.</w:t>
+      </w:r>
+    </w:p>
+    <w:p>
+      <w:pPr>
+        <w:pStyle w:val="Heading4"/>
+      </w:pPr>
+      <w:r>
+        <w:t xml:space="preserve">Demo delivery requirement. The Corporation shall retain an electronic copy of each notice and its delivery confirmation for five years.</w:t>
       </w:r>
     </w:p>
     <w:p>
@@ -20744,7 +20752,7 @@
     <w:p>
       <w:pPr>
         <w:widowControl w:val="0"/>
-        <w:spacing w:after="240"/>
+        <w:spacing w:after="240" w:before="360"/>
         <w:rPr>
           <w:szCs w:val="22"/>
         </w:rPr>
@@ -20771,6 +20779,201 @@
       </w:r>
       <w:r>
         <w:t>The following indemnification provisions shall apply to the persons enumerated below.</w:t>
+      </w:r>
+    </w:p>
+    <w:p>
+      <w:pPr>
+        <w:pStyle w:val="ExhibitA2"/>
+        <w:widowControl w:val="0"/>
+        <w:rPr>
+          <w:color w:val="000000"/>
+          <w:szCs w:val="22"/>
+        </w:rPr>
+      </w:pPr>
+      <w:bookmarkStart w:name="_DV_M358" w:id="406"/>
+      <w:bookmarkEnd w:id="406"/>
+      <w:r>
+        <w:rPr>
+          <w:color w:val="000000"/>
+          <w:szCs w:val="22"/>
+          <w:u w:val="single"/>
+        </w:rPr>
+        <w:t>Insurance</w:t>
+      </w:r>
+      <w:r>
+        <w:rPr>
+          <w:color w:val="000000"/>
+          <w:szCs w:val="22"/>
+        </w:rPr>
+        <w:t>.</w:t>
+      </w:r>
+      <w:r>
+        <w:rPr>
+          <w:color w:val="000000"/>
+          <w:szCs w:val="22"/>
+        </w:rPr>
+        <w:t xml:space="preserve"> </w:t>
+      </w:r>
+      <w:r>
+        <w:rPr>
+          <w:color w:val="000000"/>
+          <w:szCs w:val="22"/>
+        </w:rPr>
+        <w:t>The Board of Directors may, to the full extent permitted by applicable law as it presently exists, or may hereafter be amended from time to time, authorize an appropriate officer or officers to purchase and maintain at the Corporation’s expense insurance:</w:t>
+      </w:r>
+      <w:r>
+        <w:rPr>
+          <w:color w:val="000000"/>
+          <w:szCs w:val="22"/>
+        </w:rPr>
+        <w:t xml:space="preserve"> </w:t>
+      </w:r>
+      <w:r>
+        <w:rPr>
+          <w:color w:val="000000"/>
+          <w:szCs w:val="22"/>
+        </w:rPr>
+        <w:t xml:space="preserve">(a) to indemnify the Corporation for any obligation which it incurs as a result of the indemnification of directors, officers and employees under the provisions of this </w:t>
+      </w:r>
+      <w:r>
+        <w:rPr>
+          <w:color w:val="000000"/>
+          <w:szCs w:val="22"/>
+          <w:u w:val="single"/>
+        </w:rPr>
+        <w:t xml:space="preserve">Article </w:t>
+      </w:r>
+      <w:r>
+        <w:rPr>
+          <w:color w:val="000000"/>
+          <w:szCs w:val="22"/>
+          <w:u w:val="single"/>
+        </w:rPr>
+        <w:fldChar w:fldCharType="begin"/>
+      </w:r>
+      <w:r>
+        <w:rPr>
+          <w:color w:val="000000"/>
+          <w:szCs w:val="22"/>
+          <w:u w:val="single"/>
+        </w:rPr>
+        <w:instrText xml:space="preserve"> REF _Ref444618270 \n \h </w:instrText>
+      </w:r>
+      <w:r>
+        <w:rPr>
+          <w:color w:val="000000"/>
+          <w:szCs w:val="22"/>
+          <w:u w:val="single"/>
+        </w:rPr>
+        <w:instrText xml:space="preserve"> \* MERGEFORMAT </w:instrText>
+      </w:r>
+      <w:r>
+        <w:rPr>
+          <w:color w:val="000000"/>
+          <w:szCs w:val="22"/>
+          <w:u w:val="single"/>
+        </w:rPr>
+      </w:r>
+      <w:r>
+        <w:rPr>
+          <w:color w:val="000000"/>
+          <w:szCs w:val="22"/>
+          <w:u w:val="single"/>
+        </w:rPr>
+        <w:fldChar w:fldCharType="separate"/>
+      </w:r>
+      <w:r>
+        <w:rPr>
+          <w:color w:val="000000"/>
+          <w:szCs w:val="22"/>
+          <w:u w:val="single"/>
+        </w:rPr>
+        <w:t>Tenth</w:t>
+      </w:r>
+      <w:r>
+        <w:rPr>
+          <w:color w:val="000000"/>
+          <w:szCs w:val="22"/>
+          <w:u w:val="single"/>
+        </w:rPr>
+        <w:fldChar w:fldCharType="end"/>
+      </w:r>
+      <w:r>
+        <w:rPr>
+          <w:color w:val="000000"/>
+          <w:szCs w:val="22"/>
+        </w:rPr>
+        <w:t xml:space="preserve">; and (b) to indemnify or insure directors, officers and employees against liability in instances in which they may not otherwise be indemnified by the Corporation under the provisions of this </w:t>
+      </w:r>
+      <w:r>
+        <w:rPr>
+          <w:color w:val="000000"/>
+          <w:szCs w:val="22"/>
+          <w:u w:val="single"/>
+        </w:rPr>
+        <w:t xml:space="preserve">Article </w:t>
+      </w:r>
+      <w:r>
+        <w:rPr>
+          <w:color w:val="000000"/>
+          <w:szCs w:val="22"/>
+          <w:u w:val="single"/>
+        </w:rPr>
+        <w:fldChar w:fldCharType="begin"/>
+      </w:r>
+      <w:r>
+        <w:rPr>
+          <w:color w:val="000000"/>
+          <w:szCs w:val="22"/>
+          <w:u w:val="single"/>
+        </w:rPr>
+        <w:instrText xml:space="preserve"> REF _Ref444618270 \n \h </w:instrText>
+      </w:r>
+      <w:r>
+        <w:rPr>
+          <w:color w:val="000000"/>
+          <w:szCs w:val="22"/>
+          <w:u w:val="single"/>
+        </w:rPr>
+        <w:instrText xml:space="preserve"> \* MERGEFORMAT </w:instrText>
+      </w:r>
+      <w:r>
+        <w:rPr>
+          <w:color w:val="000000"/>
+          <w:szCs w:val="22"/>
+          <w:u w:val="single"/>
+        </w:rPr>
+      </w:r>
+      <w:r>
+        <w:rPr>
+          <w:color w:val="000000"/>
+          <w:szCs w:val="22"/>
+          <w:u w:val="single"/>
+        </w:rPr>
+        <w:fldChar w:fldCharType="separate"/>
+      </w:r>
+      <w:r>
+        <w:rPr>
+          <w:color w:val="000000"/>
+          <w:szCs w:val="22"/>
+          <w:u w:val="single"/>
+        </w:rPr>
+        <w:t>Tenth</w:t>
+      </w:r>
+      <w:r>
+        <w:rPr>
+          <w:color w:val="000000"/>
+          <w:szCs w:val="22"/>
+          <w:u w:val="single"/>
+        </w:rPr>
+        <w:fldChar w:fldCharType="end"/>
+      </w:r>
+      <w:r>
+        <w:rPr>
+          <w:color w:val="000000"/>
+          <w:szCs w:val="22"/>
+        </w:rPr>
+        <w:t>.</w:t>
       </w:r>
     </w:p>
     <w:p>
@@ -21293,7 +21496,7 @@
           <w:color w:val="000000"/>
           <w:szCs w:val="22"/>
         </w:rPr>
-        <w:t>is not paid in full within 30 days after a written claim therefor by the Indemnified Person has been received by the Corporation, the Indemnified Person may file suit to recover the unpaid amount of such claim and, if successful in whole or in part, shall be entitled to be paid the expense of prosecuting such claim.</w:t>
+        <w:t xml:space="preserve">is not paid in full within 45 days after a written claim therefor by the Indemnified Person has been received by the Corporation, the Indemnified Person may file suit to recover the unpaid amount of such claim and, if successful in whole or in part, shall be entitled to be paid the expense of prosecuting such claim.</w:t>
       </w:r>
       <w:r>
         <w:rPr>
@@ -21403,15 +21606,15 @@
           <w:szCs w:val="22"/>
         </w:rPr>
       </w:pPr>
-      <w:bookmarkStart w:name="_DV_M355" w:id="403"/>
-      <w:bookmarkEnd w:id="403"/>
+      <w:bookmarkStart w:name="_DV_M356" w:id="404"/>
+      <w:bookmarkEnd w:id="404"/>
       <w:r>
         <w:rPr>
           <w:color w:val="000000"/>
           <w:szCs w:val="22"/>
           <w:u w:val="single"/>
         </w:rPr>
-        <w:t>Advancement of Expenses of Employees and Agents</w:t>
+        <w:t>Non-Exclusivity of Rights</w:t>
       </w:r>
       <w:r>
         <w:rPr>
@@ -21432,7 +21635,77 @@
           <w:color w:val="000000"/>
           <w:szCs w:val="22"/>
         </w:rPr>
-        <w:t>The Corporation may pay the expenses (including attorneys’ fees) incurred by an employee or agent in defending any Proceeding in advance of its final disposition on such terms and conditions as may be determined by the Board of Directors.</w:t>
+        <w:t xml:space="preserve">The rights conferred on any person by this </w:t>
+      </w:r>
+      <w:r>
+        <w:rPr>
+          <w:color w:val="000000"/>
+          <w:szCs w:val="22"/>
+          <w:u w:val="single"/>
+        </w:rPr>
+        <w:t xml:space="preserve">Article </w:t>
+      </w:r>
+      <w:r>
+        <w:rPr>
+          <w:color w:val="000000"/>
+          <w:szCs w:val="22"/>
+          <w:u w:val="single"/>
+        </w:rPr>
+        <w:fldChar w:fldCharType="begin"/>
+      </w:r>
+      <w:r>
+        <w:rPr>
+          <w:color w:val="000000"/>
+          <w:szCs w:val="22"/>
+          <w:u w:val="single"/>
+        </w:rPr>
+        <w:instrText xml:space="preserve"> REF _Ref444618270 \n \h </w:instrText>
+      </w:r>
+      <w:r>
+        <w:rPr>
+          <w:color w:val="000000"/>
+          <w:szCs w:val="22"/>
+          <w:u w:val="single"/>
+        </w:rPr>
+        <w:instrText xml:space="preserve"> \* MERGEFORMAT </w:instrText>
+      </w:r>
+      <w:r>
+        <w:rPr>
+          <w:color w:val="000000"/>
+          <w:szCs w:val="22"/>
+          <w:u w:val="single"/>
+        </w:rPr>
+      </w:r>
+      <w:r>
+        <w:rPr>
+          <w:color w:val="000000"/>
+          <w:szCs w:val="22"/>
+          <w:u w:val="single"/>
+        </w:rPr>
+        <w:fldChar w:fldCharType="separate"/>
+      </w:r>
+      <w:r>
+        <w:rPr>
+          <w:color w:val="000000"/>
+          <w:szCs w:val="22"/>
+          <w:u w:val="single"/>
+        </w:rPr>
+        <w:t>Tenth</w:t>
+      </w:r>
+      <w:r>
+        <w:rPr>
+          <w:color w:val="000000"/>
+          <w:szCs w:val="22"/>
+          <w:u w:val="single"/>
+        </w:rPr>
+        <w:fldChar w:fldCharType="end"/>
+      </w:r>
+      <w:r>
+        <w:rPr>
+          <w:color w:val="000000"/>
+          <w:szCs w:val="22"/>
+        </w:rPr>
+        <w:t xml:space="preserve"> shall not be exclusive of any other rights which such person may have or hereafter acquire under any statute, provision of this Certificate of Incorporation, the Bylaws of the Corporation, or any agreement, or pursuant to any vote of stockholders or disinterested directors or otherwise.</w:t>
       </w:r>
     </w:p>
     <w:p>
@@ -21444,15 +21717,15 @@
           <w:szCs w:val="22"/>
         </w:rPr>
       </w:pPr>
-      <w:bookmarkStart w:name="_DV_M356" w:id="404"/>
-      <w:bookmarkEnd w:id="404"/>
+      <w:bookmarkStart w:name="_DV_M357" w:id="405"/>
+      <w:bookmarkEnd w:id="405"/>
       <w:r>
         <w:rPr>
           <w:color w:val="000000"/>
           <w:szCs w:val="22"/>
           <w:u w:val="single"/>
         </w:rPr>
-        <w:t>Non-Exclusivity of Rights</w:t>
+        <w:t>Other Indemnification</w:t>
       </w:r>
       <w:r>
         <w:rPr>
@@ -21473,77 +21746,35 @@
           <w:color w:val="000000"/>
           <w:szCs w:val="22"/>
         </w:rPr>
-        <w:t xml:space="preserve">The rights conferred on any person by this </w:t>
+        <w:t xml:space="preserve">The Corporation’s obligation, if any, to indemnify any person who was or is serving at its request as a director, officer or employee of another </w:t>
       </w:r>
       <w:r>
         <w:rPr>
           <w:color w:val="000000"/>
           <w:szCs w:val="22"/>
-          <w:u w:val="single"/>
-        </w:rPr>
-        <w:t xml:space="preserve">Article </w:t>
+        </w:rPr>
+        <w:t>c</w:t>
       </w:r>
       <w:r>
         <w:rPr>
           <w:color w:val="000000"/>
           <w:szCs w:val="22"/>
-          <w:u w:val="single"/>
-        </w:rPr>
-        <w:fldChar w:fldCharType="begin"/>
+        </w:rPr>
+        <w:t xml:space="preserve">orporation, partnership, limited liability company, joint venture, trust, organization or other enterprise shall be reduced by any amount such person may collect as indemnification from such other </w:t>
       </w:r>
       <w:r>
         <w:rPr>
           <w:color w:val="000000"/>
           <w:szCs w:val="22"/>
-          <w:u w:val="single"/>
-        </w:rPr>
-        <w:instrText xml:space="preserve"> REF _Ref444618270 \n \h </w:instrText>
+        </w:rPr>
+        <w:t>c</w:t>
       </w:r>
       <w:r>
         <w:rPr>
           <w:color w:val="000000"/>
           <w:szCs w:val="22"/>
-          <w:u w:val="single"/>
-        </w:rPr>
-        <w:instrText xml:space="preserve"> \* MERGEFORMAT </w:instrText>
-      </w:r>
-      <w:r>
-        <w:rPr>
-          <w:color w:val="000000"/>
-          <w:szCs w:val="22"/>
-          <w:u w:val="single"/>
-        </w:rPr>
-      </w:r>
-      <w:r>
-        <w:rPr>
-          <w:color w:val="000000"/>
-          <w:szCs w:val="22"/>
-          <w:u w:val="single"/>
-        </w:rPr>
-        <w:fldChar w:fldCharType="separate"/>
-      </w:r>
-      <w:r>
-        <w:rPr>
-          <w:color w:val="000000"/>
-          <w:szCs w:val="22"/>
-          <w:u w:val="single"/>
-        </w:rPr>
-        <w:t>Tenth</w:t>
-      </w:r>
-      <w:r>
-        <w:rPr>
-          <w:color w:val="000000"/>
-          <w:szCs w:val="22"/>
-          <w:u w:val="single"/>
-        </w:rPr>
-        <w:fldChar w:fldCharType="end"/>
-      </w:r>
-      <w:r>
-        <w:rPr>
-          <w:color w:val="000000"/>
-          <w:szCs w:val="22"/>
-        </w:rPr>
-        <w:t xml:space="preserve"> shall not be exclusive of any other rights which such person may have or hereafter acquire under any statute, provision of this Certificate of Incorporation, the Bylaws of the Corporation, or any agreement, or pursuant to any vote of stockholders or disinterested directors or otherwise.</w:t>
+        </w:rPr>
+        <w:t>orporation, partnership, limited liability company, joint venture, trust, organization or other enterprise.</w:t>
       </w:r>
     </w:p>
     <w:p>
@@ -21555,15 +21786,15 @@
           <w:szCs w:val="22"/>
         </w:rPr>
       </w:pPr>
-      <w:bookmarkStart w:name="_DV_M357" w:id="405"/>
-      <w:bookmarkEnd w:id="405"/>
+      <w:bookmarkStart w:name="_DV_M359" w:id="407"/>
+      <w:bookmarkEnd w:id="407"/>
       <w:r>
         <w:rPr>
           <w:color w:val="000000"/>
           <w:szCs w:val="22"/>
           <w:u w:val="single"/>
         </w:rPr>
-        <w:t>Other Indemnification</w:t>
+        <w:t>Amendment or Repeal</w:t>
       </w:r>
       <w:r>
         <w:rPr>
@@ -21584,369 +21815,220 @@
           <w:color w:val="000000"/>
           <w:szCs w:val="22"/>
         </w:rPr>
-        <w:t xml:space="preserve">The Corporation’s obligation, if any, to indemnify any person who was or is serving at its request as a director, officer or employee of another </w:t>
+        <w:t>Any repeal or modification of the for</w:t>
       </w:r>
       <w:r>
         <w:rPr>
           <w:color w:val="000000"/>
           <w:szCs w:val="22"/>
         </w:rPr>
-        <w:t>c</w:t>
+        <w:t>e</w:t>
       </w:r>
       <w:r>
         <w:rPr>
           <w:color w:val="000000"/>
           <w:szCs w:val="22"/>
         </w:rPr>
-        <w:t xml:space="preserve">orporation, partnership, limited liability company, joint venture, trust, organization or other enterprise shall be reduced by any amount such person may collect as indemnification from such other </w:t>
+        <w:t xml:space="preserve">going provisions of this </w:t>
       </w:r>
       <w:r>
         <w:rPr>
           <w:color w:val="000000"/>
           <w:szCs w:val="22"/>
-        </w:rPr>
-        <w:t>c</w:t>
+          <w:u w:val="single"/>
+        </w:rPr>
+        <w:t xml:space="preserve">Article </w:t>
       </w:r>
       <w:r>
         <w:rPr>
           <w:color w:val="000000"/>
           <w:szCs w:val="22"/>
-        </w:rPr>
-        <w:t>orporation, partnership, limited liability company, joint venture, trust, organization or other enterprise.</w:t>
+          <w:u w:val="single"/>
+        </w:rPr>
+        <w:fldChar w:fldCharType="begin"/>
+      </w:r>
+      <w:r>
+        <w:rPr>
+          <w:color w:val="000000"/>
+          <w:szCs w:val="22"/>
+          <w:u w:val="single"/>
+        </w:rPr>
+        <w:instrText xml:space="preserve"> REF _Ref444618270 \n \h </w:instrText>
+      </w:r>
+      <w:r>
+        <w:rPr>
+          <w:color w:val="000000"/>
+          <w:szCs w:val="22"/>
+          <w:u w:val="single"/>
+        </w:rPr>
+        <w:instrText xml:space="preserve"> \* MERGEFORMAT </w:instrText>
+      </w:r>
+      <w:r>
+        <w:rPr>
+          <w:color w:val="000000"/>
+          <w:szCs w:val="22"/>
+          <w:u w:val="single"/>
+        </w:rPr>
+      </w:r>
+      <w:r>
+        <w:rPr>
+          <w:color w:val="000000"/>
+          <w:szCs w:val="22"/>
+          <w:u w:val="single"/>
+        </w:rPr>
+        <w:fldChar w:fldCharType="separate"/>
+      </w:r>
+      <w:r>
+        <w:rPr>
+          <w:color w:val="000000"/>
+          <w:szCs w:val="22"/>
+          <w:u w:val="single"/>
+        </w:rPr>
+        <w:t>Tenth</w:t>
+      </w:r>
+      <w:r>
+        <w:rPr>
+          <w:color w:val="000000"/>
+          <w:szCs w:val="22"/>
+          <w:u w:val="single"/>
+        </w:rPr>
+        <w:fldChar w:fldCharType="end"/>
+      </w:r>
+      <w:r>
+        <w:rPr>
+          <w:color w:val="000000"/>
+          <w:szCs w:val="22"/>
+        </w:rPr>
+        <w:t xml:space="preserve"> shall not adversely affect any right or protection hereunder of any person in respect of any act or omission occurring prior to the time of such repeal or modification.</w:t>
+      </w:r>
+      <w:r>
+        <w:rPr>
+          <w:color w:val="000000"/>
+          <w:szCs w:val="22"/>
+        </w:rPr>
+        <w:t xml:space="preserve"> </w:t>
+      </w:r>
+      <w:r>
+        <w:rPr>
+          <w:color w:val="000000"/>
+          <w:szCs w:val="22"/>
+        </w:rPr>
+        <w:t>The rights provided hereunder shall inure to the benefit of any Indemnified Person and such person’s heirs, executors and administrators.</w:t>
       </w:r>
     </w:p>
     <w:p>
-      <w:pPr>
-        <w:pStyle w:val="ExhibitA2"/>
-        <w:widowControl w:val="0"/>
-        <w:rPr>
-          <w:color w:val="000000"/>
-          <w:szCs w:val="22"/>
-        </w:rPr>
-      </w:pPr>
-      <w:bookmarkStart w:name="_DV_M358" w:id="406"/>
-      <w:bookmarkEnd w:id="406"/>
-      <w:r>
-        <w:rPr>
-          <w:color w:val="000000"/>
-          <w:szCs w:val="22"/>
-          <w:u w:val="single"/>
-        </w:rPr>
-        <w:t>Insurance</w:t>
-      </w:r>
-      <w:r>
-        <w:rPr>
-          <w:color w:val="000000"/>
-          <w:szCs w:val="22"/>
-        </w:rPr>
-        <w:t>.</w:t>
-      </w:r>
-      <w:r>
-        <w:rPr>
-          <w:color w:val="000000"/>
-          <w:szCs w:val="22"/>
-        </w:rPr>
-        <w:t xml:space="preserve"> </w:t>
-      </w:r>
-      <w:r>
-        <w:rPr>
-          <w:color w:val="000000"/>
-          <w:szCs w:val="22"/>
-        </w:rPr>
-        <w:t>The Board of Directors may, to the full extent permitted by applicable law as it presently exists, or may hereafter be amended from time to time, authorize an appropriate officer or officers to purchase and maintain at the Corporation’s expense insurance:</w:t>
-      </w:r>
-      <w:r>
-        <w:rPr>
-          <w:color w:val="000000"/>
-          <w:szCs w:val="22"/>
-        </w:rPr>
-        <w:t xml:space="preserve"> </w:t>
-      </w:r>
-      <w:r>
-        <w:rPr>
-          <w:color w:val="000000"/>
-          <w:szCs w:val="22"/>
-        </w:rPr>
-        <w:t xml:space="preserve">(a) to indemnify the Corporation for any obligation which it incurs as a result of the indemnification of directors, officers and employees under the provisions of this </w:t>
-      </w:r>
-      <w:r>
-        <w:rPr>
-          <w:color w:val="000000"/>
-          <w:szCs w:val="22"/>
-          <w:u w:val="single"/>
-        </w:rPr>
-        <w:t xml:space="preserve">Article </w:t>
-      </w:r>
-      <w:r>
-        <w:rPr>
-          <w:color w:val="000000"/>
-          <w:szCs w:val="22"/>
-          <w:u w:val="single"/>
-        </w:rPr>
-        <w:fldChar w:fldCharType="begin"/>
-      </w:r>
-      <w:r>
-        <w:rPr>
-          <w:color w:val="000000"/>
-          <w:szCs w:val="22"/>
-          <w:u w:val="single"/>
-        </w:rPr>
-        <w:instrText xml:space="preserve"> REF _Ref444618270 \n \h </w:instrText>
-      </w:r>
-      <w:r>
-        <w:rPr>
-          <w:color w:val="000000"/>
-          <w:szCs w:val="22"/>
-          <w:u w:val="single"/>
-        </w:rPr>
-        <w:instrText xml:space="preserve"> \* MERGEFORMAT </w:instrText>
-      </w:r>
-      <w:r>
-        <w:rPr>
-          <w:color w:val="000000"/>
-          <w:szCs w:val="22"/>
-          <w:u w:val="single"/>
-        </w:rPr>
-      </w:r>
-      <w:r>
-        <w:rPr>
-          <w:color w:val="000000"/>
-          <w:szCs w:val="22"/>
-          <w:u w:val="single"/>
-        </w:rPr>
-        <w:fldChar w:fldCharType="separate"/>
-      </w:r>
-      <w:r>
-        <w:rPr>
-          <w:color w:val="000000"/>
-          <w:szCs w:val="22"/>
-          <w:u w:val="single"/>
-        </w:rPr>
-        <w:t>Tenth</w:t>
-      </w:r>
-      <w:r>
-        <w:rPr>
-          <w:color w:val="000000"/>
-          <w:szCs w:val="22"/>
-          <w:u w:val="single"/>
-        </w:rPr>
-        <w:fldChar w:fldCharType="end"/>
-      </w:r>
-      <w:r>
-        <w:rPr>
-          <w:color w:val="000000"/>
-          <w:szCs w:val="22"/>
-        </w:rPr>
-        <w:t xml:space="preserve">; and (b) to indemnify or insure directors, officers and employees against liability in instances in which they may not otherwise be indemnified by the Corporation under the provisions of this </w:t>
-      </w:r>
-      <w:r>
-        <w:rPr>
-          <w:color w:val="000000"/>
-          <w:szCs w:val="22"/>
-          <w:u w:val="single"/>
-        </w:rPr>
-        <w:t xml:space="preserve">Article </w:t>
-      </w:r>
-      <w:r>
-        <w:rPr>
-          <w:color w:val="000000"/>
-          <w:szCs w:val="22"/>
-          <w:u w:val="single"/>
-        </w:rPr>
-        <w:fldChar w:fldCharType="begin"/>
-      </w:r>
-      <w:r>
-        <w:rPr>
-          <w:color w:val="000000"/>
-          <w:szCs w:val="22"/>
-          <w:u w:val="single"/>
-        </w:rPr>
-        <w:instrText xml:space="preserve"> REF _Ref444618270 \n \h </w:instrText>
-      </w:r>
-      <w:r>
-        <w:rPr>
-          <w:color w:val="000000"/>
-          <w:szCs w:val="22"/>
-          <w:u w:val="single"/>
-        </w:rPr>
-        <w:instrText xml:space="preserve"> \* MERGEFORMAT </w:instrText>
-      </w:r>
-      <w:r>
-        <w:rPr>
-          <w:color w:val="000000"/>
-          <w:szCs w:val="22"/>
-          <w:u w:val="single"/>
-        </w:rPr>
-      </w:r>
-      <w:r>
-        <w:rPr>
-          <w:color w:val="000000"/>
-          <w:szCs w:val="22"/>
-          <w:u w:val="single"/>
-        </w:rPr>
-        <w:fldChar w:fldCharType="separate"/>
-      </w:r>
-      <w:r>
-        <w:rPr>
-          <w:color w:val="000000"/>
-          <w:szCs w:val="22"/>
-          <w:u w:val="single"/>
-        </w:rPr>
-        <w:t>Tenth</w:t>
-      </w:r>
-      <w:r>
-        <w:rPr>
-          <w:color w:val="000000"/>
-          <w:szCs w:val="22"/>
-          <w:u w:val="single"/>
-        </w:rPr>
-        <w:fldChar w:fldCharType="end"/>
-      </w:r>
-      <w:r>
-        <w:rPr>
-          <w:color w:val="000000"/>
-          <w:szCs w:val="22"/>
-        </w:rPr>
-        <w:t>.</w:t>
+      <w:r>
+        <w:t xml:space="preserve">DEMONSTRATION ONLY — TERMS SNAPSHOT</w:t>
       </w:r>
     </w:p>
+    <w:tbl>
+      <w:tblPr>
+        <w:tblW w:w="9000" w:type="dxa"/>
+        <w:tblBorders>
+          <w:top w:val="single" w:sz="4" w:color="808080"/>
+          <w:left w:val="single" w:sz="4" w:color="808080"/>
+          <w:bottom w:val="single" w:sz="4" w:color="808080"/>
+          <w:right w:val="single" w:sz="4" w:color="808080"/>
+          <w:insideH w:val="single" w:sz="4" w:color="808080"/>
+          <w:insideV w:val="single" w:sz="4" w:color="808080"/>
+        </w:tblBorders>
+      </w:tblPr>
+      <w:tblGrid>
+        <w:gridCol w:w="4500"/>
+        <w:gridCol w:w="4500"/>
+      </w:tblGrid>
+      <w:tr>
+        <w:tc>
+          <w:tcPr>
+            <w:tcW w:w="4500" w:type="dxa"/>
+          </w:tcPr>
+          <w:p>
+            <w:r>
+              <w:t xml:space="preserve">DEMO ONLY — term</w:t>
+            </w:r>
+          </w:p>
+        </w:tc>
+        <w:tc>
+          <w:tcPr>
+            <w:tcW w:w="4500" w:type="dxa"/>
+          </w:tcPr>
+          <w:p>
+            <w:r>
+              <w:t xml:space="preserve">Proposed value</w:t>
+            </w:r>
+          </w:p>
+        </w:tc>
+      </w:tr>
+      <w:tr>
+        <w:tc>
+          <w:tcPr>
+            <w:tcW w:w="4500" w:type="dxa"/>
+          </w:tcPr>
+          <w:p>
+            <w:r>
+              <w:t xml:space="preserve">Authorized common shares</w:t>
+            </w:r>
+          </w:p>
+        </w:tc>
+        <w:tc>
+          <w:tcPr>
+            <w:tcW w:w="4500" w:type="dxa"/>
+          </w:tcPr>
+          <w:p>
+            <w:r>
+              <w:t xml:space="preserve">10,000,000</w:t>
+            </w:r>
+          </w:p>
+        </w:tc>
+      </w:tr>
+      <w:tr>
+        <w:tc>
+          <w:tcPr>
+            <w:tcW w:w="4500" w:type="dxa"/>
+          </w:tcPr>
+          <w:p>
+            <w:r>
+              <w:t xml:space="preserve">Authorized preferred shares</w:t>
+            </w:r>
+          </w:p>
+        </w:tc>
+        <w:tc>
+          <w:tcPr>
+            <w:tcW w:w="4500" w:type="dxa"/>
+          </w:tcPr>
+          <w:p>
+            <w:r>
+              <w:t xml:space="preserve">5,000,000</w:t>
+            </w:r>
+          </w:p>
+        </w:tc>
+      </w:tr>
+      <w:tr>
+        <w:tc>
+          <w:tcPr>
+            <w:tcW w:w="4500" w:type="dxa"/>
+          </w:tcPr>
+          <w:p>
+            <w:r>
+              <w:t xml:space="preserve">Liquidation preference</w:t>
+            </w:r>
+          </w:p>
+        </w:tc>
+        <w:tc>
+          <w:tcPr>
+            <w:tcW w:w="4500" w:type="dxa"/>
+          </w:tcPr>
+          <w:p>
+            <w:r>
+              <w:t xml:space="preserve">1.5 times</w:t>
+            </w:r>
+          </w:p>
+        </w:tc>
+      </w:tr>
+    </w:tbl>
     <w:p>
-      <w:pPr>
-        <w:pStyle w:val="ExhibitA2"/>
-        <w:widowControl w:val="0"/>
-        <w:rPr>
-          <w:color w:val="000000"/>
-          <w:szCs w:val="22"/>
-        </w:rPr>
-      </w:pPr>
-      <w:bookmarkStart w:name="_DV_M359" w:id="407"/>
-      <w:bookmarkEnd w:id="407"/>
-      <w:r>
-        <w:rPr>
-          <w:color w:val="000000"/>
-          <w:szCs w:val="22"/>
-          <w:u w:val="single"/>
-        </w:rPr>
-        <w:t>Amendment or Repeal</w:t>
-      </w:r>
-      <w:r>
-        <w:rPr>
-          <w:color w:val="000000"/>
-          <w:szCs w:val="22"/>
-        </w:rPr>
-        <w:t>.</w:t>
-      </w:r>
-      <w:r>
-        <w:rPr>
-          <w:color w:val="000000"/>
-          <w:szCs w:val="22"/>
-        </w:rPr>
-        <w:t xml:space="preserve"> </w:t>
-      </w:r>
-      <w:r>
-        <w:rPr>
-          <w:color w:val="000000"/>
-          <w:szCs w:val="22"/>
-        </w:rPr>
-        <w:t>Any repeal or modification of the for</w:t>
-      </w:r>
-      <w:r>
-        <w:rPr>
-          <w:color w:val="000000"/>
-          <w:szCs w:val="22"/>
-        </w:rPr>
-        <w:t>e</w:t>
-      </w:r>
-      <w:r>
-        <w:rPr>
-          <w:color w:val="000000"/>
-          <w:szCs w:val="22"/>
-        </w:rPr>
-        <w:t xml:space="preserve">going provisions of this </w:t>
-      </w:r>
-      <w:r>
-        <w:rPr>
-          <w:color w:val="000000"/>
-          <w:szCs w:val="22"/>
-          <w:u w:val="single"/>
-        </w:rPr>
-        <w:t xml:space="preserve">Article </w:t>
-      </w:r>
-      <w:r>
-        <w:rPr>
-          <w:color w:val="000000"/>
-          <w:szCs w:val="22"/>
-          <w:u w:val="single"/>
-        </w:rPr>
-        <w:fldChar w:fldCharType="begin"/>
-      </w:r>
-      <w:r>
-        <w:rPr>
-          <w:color w:val="000000"/>
-          <w:szCs w:val="22"/>
-          <w:u w:val="single"/>
-        </w:rPr>
-        <w:instrText xml:space="preserve"> REF _Ref444618270 \n \h </w:instrText>
-      </w:r>
-      <w:r>
-        <w:rPr>
-          <w:color w:val="000000"/>
-          <w:szCs w:val="22"/>
-          <w:u w:val="single"/>
-        </w:rPr>
-        <w:instrText xml:space="preserve"> \* MERGEFORMAT </w:instrText>
-      </w:r>
-      <w:r>
-        <w:rPr>
-          <w:color w:val="000000"/>
-          <w:szCs w:val="22"/>
-          <w:u w:val="single"/>
-        </w:rPr>
-      </w:r>
-      <w:r>
-        <w:rPr>
-          <w:color w:val="000000"/>
-          <w:szCs w:val="22"/>
-          <w:u w:val="single"/>
-        </w:rPr>
-        <w:fldChar w:fldCharType="separate"/>
-      </w:r>
-      <w:r>
-        <w:rPr>
-          <w:color w:val="000000"/>
-          <w:szCs w:val="22"/>
-          <w:u w:val="single"/>
-        </w:rPr>
-        <w:t>Tenth</w:t>
-      </w:r>
-      <w:r>
-        <w:rPr>
-          <w:color w:val="000000"/>
-          <w:szCs w:val="22"/>
-          <w:u w:val="single"/>
-        </w:rPr>
-        <w:fldChar w:fldCharType="end"/>
-      </w:r>
-      <w:r>
-        <w:rPr>
-          <w:color w:val="000000"/>
-          <w:szCs w:val="22"/>
-        </w:rPr>
-        <w:t xml:space="preserve"> shall not adversely affect any right or protection hereunder of any person in respect of any act or omission occurring prior to the time of such repeal or modification.</w:t>
-      </w:r>
-      <w:r>
-        <w:rPr>
-          <w:color w:val="000000"/>
-          <w:szCs w:val="22"/>
-        </w:rPr>
-        <w:t xml:space="preserve"> </w:t>
-      </w:r>
-      <w:r>
-        <w:rPr>
-          <w:color w:val="000000"/>
-          <w:szCs w:val="22"/>
-        </w:rPr>
-        <w:t>The rights provided hereunder shall inure to the benefit of any Indemnified Person and such person’s heirs, executors and administrators.</w:t>
+      <w:r>
+        <w:t xml:space="preserve">Synthetic edits for software testing; the model's other alternatives and placeholders remain.</w:t>
       </w:r>
     </w:p>
     <w:sectPr>
@@ -22565,6 +22647,9 @@
       </w:r>
       <w:r>
         <w:t xml:space="preserve"> (Del. Ch. Apr. 26, 1991).</w:t>
+      </w:r>
+      <w:r>
+        <w:t xml:space="preserve"> Demo note: this footnote is intentionally expanded to exercise comparison outside the document body.</w:t>
       </w:r>
     </w:p>
   </w:footnote>

</xml_diff>